<commit_message>
Updated Approved folders and Pseudocode heading standard.
</commit_message>
<xml_diff>
--- a/01_Standards/Milestone_5_Algorithms/M5_Pseudocode_Algorithms_Standards.docx
+++ b/01_Standards/Milestone_5_Algorithms/M5_Pseudocode_Algorithms_Standards.docx
@@ -432,7 +432,7 @@
           <w:color w:val="0070C0"/>
           <w:lang w:eastAsia="en-US"/>
         </w:rPr>
-        <w:t>(Arial 13.5 Bold, Outline Level</w:t>
+        <w:t>(Arial 1</w:t>
       </w:r>
       <w:r>
         <w:rPr>
@@ -440,6 +440,22 @@
           <w:color w:val="0070C0"/>
           <w:lang w:eastAsia="en-US"/>
         </w:rPr>
+        <w:t>2</w:t>
+      </w:r>
+      <w:r>
+        <w:rPr>
+          <w:rFonts w:eastAsia="Times New Roman" w:cs="Times New Roman"/>
+          <w:color w:val="0070C0"/>
+          <w:lang w:eastAsia="en-US"/>
+        </w:rPr>
+        <w:t xml:space="preserve"> Bold, Outline Level</w:t>
+      </w:r>
+      <w:r>
+        <w:rPr>
+          <w:rFonts w:eastAsia="Times New Roman" w:cs="Times New Roman"/>
+          <w:color w:val="0070C0"/>
+          <w:lang w:eastAsia="en-US"/>
+        </w:rPr>
         <w:t>:</w:t>
       </w:r>
       <w:r>
@@ -448,7 +464,23 @@
           <w:color w:val="0070C0"/>
           <w:lang w:eastAsia="en-US"/>
         </w:rPr>
-        <w:t xml:space="preserve"> 3 Header, Keep with next)</w:t>
+        <w:t xml:space="preserve"> </w:t>
+      </w:r>
+      <w:r>
+        <w:rPr>
+          <w:rFonts w:eastAsia="Times New Roman" w:cs="Times New Roman"/>
+          <w:color w:val="0070C0"/>
+          <w:lang w:eastAsia="en-US"/>
+        </w:rPr>
+        <w:t>4</w:t>
+      </w:r>
+      <w:r>
+        <w:rPr>
+          <w:rFonts w:eastAsia="Times New Roman" w:cs="Times New Roman"/>
+          <w:color w:val="0070C0"/>
+          <w:lang w:eastAsia="en-US"/>
+        </w:rPr>
+        <w:t xml:space="preserve"> Header, Keep with next)</w:t>
       </w:r>
     </w:p>
     <w:p>
@@ -1457,7 +1489,7 @@
           <w:position w:val="-2"/>
         </w:rPr>
         <w:drawing>
-          <wp:inline distT="0" distB="0" distL="0" distR="0" wp14:anchorId="395587FA" wp14:editId="214E64F4">
+          <wp:inline distT="0" distB="0" distL="0" distR="0" wp14:anchorId="5BA15BFD" wp14:editId="5852D957">
             <wp:extent cx="164063" cy="118237"/>
             <wp:effectExtent l="0" t="0" r="7620" b="0"/>
             <wp:docPr id="2107716770" name="Picture 1"/>
@@ -1502,22 +1534,13 @@
         </w:drawing>
       </w:r>
       <w:r>
-        <w:t>)</w:t>
-      </w:r>
-      <w:r>
-        <w:t xml:space="preserve"> </w:t>
+        <w:t xml:space="preserve">) </w:t>
       </w:r>
       <w:r>
         <w:rPr>
           <w:highlight w:val="green"/>
         </w:rPr>
-        <w:t xml:space="preserve">to assign </w:t>
-      </w:r>
-      <w:r>
-        <w:rPr>
-          <w:highlight w:val="green"/>
-        </w:rPr>
-        <w:t>values to variables</w:t>
+        <w:t>to assign values to variables</w:t>
       </w:r>
     </w:p>
     <w:p>
@@ -2223,7 +2246,7 @@
     </w:p>
     <w:p>
       <w:pPr>
-        <w:pStyle w:val="135ptHeading"/>
+        <w:pStyle w:val="12ptHeading"/>
       </w:pPr>
       <w:r>
         <w:t xml:space="preserve">1.11.3-ALG </w:t>

</xml_diff>